<commit_message>
20250819 Kelvin modify update case need check same job.
</commit_message>
<xml_diff>
--- a/API.docx
+++ b/API.docx
@@ -13790,7 +13790,49 @@
           <w:sz w:val="18"/>
           <w:szCs w:val="18"/>
         </w:rPr>
-        <w:t>"caseName3"</w:t>
+        <w:t>"News_0016#A123456710#</w:t>
+      </w:r>
+      <w:r>
+        <w:rPr>
+          <w:rFonts w:ascii="Consolas" w:eastAsia="新細明體" w:hAnsi="Consolas" w:cs="新細明體"/>
+          <w:color w:val="0451A5"/>
+          <w:kern w:val="0"/>
+          <w:sz w:val="18"/>
+          <w:szCs w:val="18"/>
+        </w:rPr>
+        <w:t>王小明</w:t>
+      </w:r>
+      <w:r>
+        <w:rPr>
+          <w:rFonts w:ascii="Consolas" w:eastAsia="新細明體" w:hAnsi="Consolas" w:cs="新細明體"/>
+          <w:color w:val="0451A5"/>
+          <w:kern w:val="0"/>
+          <w:sz w:val="18"/>
+          <w:szCs w:val="18"/>
+        </w:rPr>
+        <w:t>#M#01.</w:t>
+      </w:r>
+      <w:proofErr w:type="gramStart"/>
+      <w:r>
+        <w:rPr>
+          <w:rFonts w:ascii="Consolas" w:eastAsia="新細明體" w:hAnsi="Consolas" w:cs="新細明體"/>
+          <w:color w:val="0451A5"/>
+          <w:kern w:val="0"/>
+          <w:sz w:val="18"/>
+          <w:szCs w:val="18"/>
+        </w:rPr>
+        <w:t>dcm</w:t>
+      </w:r>
+      <w:proofErr w:type="gramEnd"/>
+      <w:r>
+        <w:rPr>
+          <w:rFonts w:ascii="Consolas" w:eastAsia="新細明體" w:hAnsi="Consolas" w:cs="新細明體"/>
+          <w:color w:val="0451A5"/>
+          <w:kern w:val="0"/>
+          <w:sz w:val="18"/>
+          <w:szCs w:val="18"/>
+        </w:rPr>
+        <w:t>"</w:t>
       </w:r>
       <w:r>
         <w:rPr>
@@ -13801,66 +13843,6 @@
           <w:szCs w:val="18"/>
         </w:rPr>
         <w:t>,</w:t>
-      </w:r>
-      <w:r>
-        <w:rPr>
-          <w:rFonts w:ascii="Consolas" w:eastAsia="新細明體" w:hAnsi="Consolas" w:cs="新細明體" w:hint="eastAsia"/>
-          <w:color w:val="000000"/>
-          <w:kern w:val="0"/>
-          <w:sz w:val="18"/>
-          <w:szCs w:val="18"/>
-        </w:rPr>
-        <w:t xml:space="preserve">       //</w:t>
-      </w:r>
-      <w:r>
-        <w:rPr>
-          <w:rFonts w:ascii="Consolas" w:eastAsia="新細明體" w:hAnsi="Consolas" w:cs="新細明體" w:hint="eastAsia"/>
-          <w:color w:val="000000"/>
-          <w:kern w:val="0"/>
-          <w:sz w:val="18"/>
-          <w:szCs w:val="18"/>
-        </w:rPr>
-        <w:t>更新</w:t>
-      </w:r>
-      <w:r>
-        <w:rPr>
-          <w:rFonts w:ascii="Consolas" w:eastAsia="新細明體" w:hAnsi="Consolas" w:cs="新細明體" w:hint="eastAsia"/>
-          <w:color w:val="000000"/>
-          <w:kern w:val="0"/>
-          <w:sz w:val="18"/>
-          <w:szCs w:val="18"/>
-        </w:rPr>
-        <w:t>caseName3</w:t>
-      </w:r>
-      <w:r>
-        <w:rPr>
-          <w:rFonts w:ascii="Consolas" w:eastAsia="新細明體" w:hAnsi="Consolas" w:cs="新細明體" w:hint="eastAsia"/>
-          <w:color w:val="000000"/>
-          <w:kern w:val="0"/>
-          <w:sz w:val="18"/>
-          <w:szCs w:val="18"/>
-        </w:rPr>
-        <w:t>的</w:t>
-      </w:r>
-      <w:r>
-        <w:rPr>
-          <w:rFonts w:ascii="Consolas" w:eastAsia="新細明體" w:hAnsi="Consolas" w:cs="新細明體" w:hint="eastAsia"/>
-          <w:color w:val="000000"/>
-          <w:kern w:val="0"/>
-          <w:sz w:val="18"/>
-          <w:szCs w:val="18"/>
-        </w:rPr>
-        <w:t xml:space="preserve"> </w:t>
-      </w:r>
-      <w:r>
-        <w:rPr>
-          <w:rFonts w:ascii="Consolas" w:eastAsia="新細明體" w:hAnsi="Consolas" w:cs="新細明體" w:hint="eastAsia"/>
-          <w:color w:val="000000"/>
-          <w:kern w:val="0"/>
-          <w:sz w:val="18"/>
-          <w:szCs w:val="18"/>
-        </w:rPr>
-        <w:t>資料</w:t>
       </w:r>
     </w:p>
     <w:p>
@@ -13894,7 +13876,31 @@
           <w:sz w:val="18"/>
           <w:szCs w:val="18"/>
         </w:rPr>
-        <w:t>"mapping"</w:t>
+        <w:t>"</w:t>
+      </w:r>
+      <w:proofErr w:type="spellStart"/>
+      <w:proofErr w:type="gramStart"/>
+      <w:r>
+        <w:rPr>
+          <w:rFonts w:ascii="Consolas" w:eastAsia="新細明體" w:hAnsi="Consolas" w:cs="新細明體"/>
+          <w:color w:val="A31515"/>
+          <w:kern w:val="0"/>
+          <w:sz w:val="18"/>
+          <w:szCs w:val="18"/>
+        </w:rPr>
+        <w:t>postAI</w:t>
+      </w:r>
+      <w:proofErr w:type="spellEnd"/>
+      <w:proofErr w:type="gramEnd"/>
+      <w:r>
+        <w:rPr>
+          <w:rFonts w:ascii="Consolas" w:eastAsia="新細明體" w:hAnsi="Consolas" w:cs="新細明體"/>
+          <w:color w:val="A31515"/>
+          <w:kern w:val="0"/>
+          <w:sz w:val="18"/>
+          <w:szCs w:val="18"/>
+        </w:rPr>
+        <w:t>"</w:t>
       </w:r>
       <w:r>
         <w:rPr>
@@ -13909,78 +13915,22 @@
       <w:r>
         <w:rPr>
           <w:rFonts w:ascii="Consolas" w:eastAsia="新細明體" w:hAnsi="Consolas" w:cs="新細明體"/>
-          <w:color w:val="0451A5"/>
-          <w:kern w:val="0"/>
-          <w:sz w:val="18"/>
-          <w:szCs w:val="18"/>
-        </w:rPr>
-        <w:t>"Test_caseName2"</w:t>
-      </w:r>
-      <w:r>
-        <w:rPr>
-          <w:rFonts w:ascii="Consolas" w:eastAsia="新細明體" w:hAnsi="Consolas" w:cs="新細明體" w:hint="eastAsia"/>
-          <w:color w:val="0451A5"/>
-          <w:kern w:val="0"/>
-          <w:sz w:val="18"/>
-          <w:szCs w:val="18"/>
-        </w:rPr>
-        <w:t xml:space="preserve">   </w:t>
-      </w:r>
-      <w:r>
-        <w:rPr>
-          <w:rFonts w:ascii="Consolas" w:eastAsia="新細明體" w:hAnsi="Consolas" w:cs="新細明體" w:hint="eastAsia"/>
-          <w:kern w:val="0"/>
-          <w:sz w:val="18"/>
-          <w:szCs w:val="18"/>
-        </w:rPr>
-        <w:t>//</w:t>
-      </w:r>
-      <w:r>
-        <w:rPr>
-          <w:rFonts w:ascii="Consolas" w:eastAsia="新細明體" w:hAnsi="Consolas" w:cs="新細明體" w:hint="eastAsia"/>
-          <w:kern w:val="0"/>
-          <w:sz w:val="18"/>
-          <w:szCs w:val="18"/>
-        </w:rPr>
-        <w:t>user</w:t>
-      </w:r>
-      <w:r>
-        <w:rPr>
-          <w:rFonts w:ascii="Consolas" w:eastAsia="新細明體" w:hAnsi="Consolas" w:cs="新細明體" w:hint="eastAsia"/>
-          <w:kern w:val="0"/>
-          <w:sz w:val="18"/>
-          <w:szCs w:val="18"/>
-        </w:rPr>
-        <w:t>於介面中選擇</w:t>
-      </w:r>
-      <w:r>
-        <w:rPr>
-          <w:rFonts w:ascii="Consolas" w:eastAsia="新細明體" w:hAnsi="Consolas" w:cs="新細明體" w:hint="eastAsia"/>
-          <w:kern w:val="0"/>
-          <w:sz w:val="18"/>
-          <w:szCs w:val="18"/>
-        </w:rPr>
-        <w:t>綁定的</w:t>
-      </w:r>
-      <w:proofErr w:type="spellStart"/>
-      <w:r>
-        <w:rPr>
-          <w:rFonts w:ascii="Consolas" w:eastAsia="新細明體" w:hAnsi="Consolas" w:cs="新細明體" w:hint="eastAsia"/>
-          <w:kern w:val="0"/>
-          <w:sz w:val="18"/>
-          <w:szCs w:val="18"/>
-        </w:rPr>
-        <w:t>accessNumber</w:t>
-      </w:r>
-      <w:proofErr w:type="spellEnd"/>
-      <w:r>
-        <w:rPr>
-          <w:rFonts w:ascii="Consolas" w:eastAsia="新細明體" w:hAnsi="Consolas" w:cs="新細明體" w:hint="eastAsia"/>
-          <w:kern w:val="0"/>
-          <w:sz w:val="18"/>
-          <w:szCs w:val="18"/>
-        </w:rPr>
-        <w:t>名稱</w:t>
+          <w:color w:val="098658"/>
+          <w:kern w:val="0"/>
+          <w:sz w:val="18"/>
+          <w:szCs w:val="18"/>
+        </w:rPr>
+        <w:t>0</w:t>
+      </w:r>
+      <w:r>
+        <w:rPr>
+          <w:rFonts w:ascii="Consolas" w:eastAsia="新細明體" w:hAnsi="Consolas" w:cs="新細明體"/>
+          <w:color w:val="000000"/>
+          <w:kern w:val="0"/>
+          <w:sz w:val="18"/>
+          <w:szCs w:val="18"/>
+        </w:rPr>
+        <w:t>,</w:t>
       </w:r>
     </w:p>
     <w:p>
@@ -14004,7 +13954,71 @@
           <w:sz w:val="18"/>
           <w:szCs w:val="18"/>
         </w:rPr>
-        <w:t>}</w:t>
+        <w:t>    </w:t>
+      </w:r>
+      <w:r>
+        <w:rPr>
+          <w:rFonts w:ascii="Consolas" w:eastAsia="新細明體" w:hAnsi="Consolas" w:cs="新細明體"/>
+          <w:color w:val="A31515"/>
+          <w:kern w:val="0"/>
+          <w:sz w:val="18"/>
+          <w:szCs w:val="18"/>
+        </w:rPr>
+        <w:t>"</w:t>
+      </w:r>
+      <w:proofErr w:type="spellStart"/>
+      <w:proofErr w:type="gramStart"/>
+      <w:r>
+        <w:rPr>
+          <w:rFonts w:ascii="Consolas" w:eastAsia="新細明體" w:hAnsi="Consolas" w:cs="新細明體"/>
+          <w:color w:val="A31515"/>
+          <w:kern w:val="0"/>
+          <w:sz w:val="18"/>
+          <w:szCs w:val="18"/>
+        </w:rPr>
+        <w:t>postPACS</w:t>
+      </w:r>
+      <w:proofErr w:type="spellEnd"/>
+      <w:proofErr w:type="gramEnd"/>
+      <w:r>
+        <w:rPr>
+          <w:rFonts w:ascii="Consolas" w:eastAsia="新細明體" w:hAnsi="Consolas" w:cs="新細明體"/>
+          <w:color w:val="A31515"/>
+          <w:kern w:val="0"/>
+          <w:sz w:val="18"/>
+          <w:szCs w:val="18"/>
+        </w:rPr>
+        <w:t>"</w:t>
+      </w:r>
+      <w:r>
+        <w:rPr>
+          <w:rFonts w:ascii="Consolas" w:eastAsia="新細明體" w:hAnsi="Consolas" w:cs="新細明體"/>
+          <w:color w:val="000000"/>
+          <w:kern w:val="0"/>
+          <w:sz w:val="18"/>
+          <w:szCs w:val="18"/>
+        </w:rPr>
+        <w:t>: </w:t>
+      </w:r>
+      <w:r>
+        <w:rPr>
+          <w:rFonts w:ascii="Consolas" w:eastAsia="新細明體" w:hAnsi="Consolas" w:cs="新細明體"/>
+          <w:color w:val="098658"/>
+          <w:kern w:val="0"/>
+          <w:sz w:val="18"/>
+          <w:szCs w:val="18"/>
+        </w:rPr>
+        <w:t>2</w:t>
+      </w:r>
+      <w:r>
+        <w:rPr>
+          <w:rFonts w:ascii="Consolas" w:eastAsia="新細明體" w:hAnsi="Consolas" w:cs="新細明體"/>
+          <w:color w:val="000000"/>
+          <w:kern w:val="0"/>
+          <w:sz w:val="18"/>
+          <w:szCs w:val="18"/>
+        </w:rPr>
+        <w:t>,</w:t>
       </w:r>
     </w:p>
     <w:p>
@@ -14020,6 +14034,76 @@
           <w:szCs w:val="18"/>
         </w:rPr>
       </w:pPr>
+      <w:r>
+        <w:rPr>
+          <w:rFonts w:ascii="Consolas" w:eastAsia="新細明體" w:hAnsi="Consolas" w:cs="新細明體"/>
+          <w:color w:val="000000"/>
+          <w:kern w:val="0"/>
+          <w:sz w:val="18"/>
+          <w:szCs w:val="18"/>
+        </w:rPr>
+        <w:t>    </w:t>
+      </w:r>
+      <w:r>
+        <w:rPr>
+          <w:rFonts w:ascii="Consolas" w:eastAsia="新細明體" w:hAnsi="Consolas" w:cs="新細明體"/>
+          <w:color w:val="A31515"/>
+          <w:kern w:val="0"/>
+          <w:sz w:val="18"/>
+          <w:szCs w:val="18"/>
+        </w:rPr>
+        <w:t>"job"</w:t>
+      </w:r>
+      <w:r>
+        <w:rPr>
+          <w:rFonts w:ascii="Consolas" w:eastAsia="新細明體" w:hAnsi="Consolas" w:cs="新細明體"/>
+          <w:color w:val="000000"/>
+          <w:kern w:val="0"/>
+          <w:sz w:val="18"/>
+          <w:szCs w:val="18"/>
+        </w:rPr>
+        <w:t>: </w:t>
+      </w:r>
+      <w:r>
+        <w:rPr>
+          <w:rFonts w:ascii="Consolas" w:eastAsia="新細明體" w:hAnsi="Consolas" w:cs="新細明體"/>
+          <w:color w:val="0451A5"/>
+          <w:kern w:val="0"/>
+          <w:sz w:val="18"/>
+          <w:szCs w:val="18"/>
+        </w:rPr>
+        <w:t>"</w:t>
+      </w:r>
+      <w:r>
+        <w:rPr>
+          <w:rFonts w:ascii="Consolas" w:eastAsia="新細明體" w:hAnsi="Consolas" w:cs="新細明體"/>
+          <w:color w:val="0451A5"/>
+          <w:kern w:val="0"/>
+          <w:sz w:val="18"/>
+          <w:szCs w:val="18"/>
+        </w:rPr>
+        <w:t>測試</w:t>
+      </w:r>
+      <w:r>
+        <w:rPr>
+          <w:rFonts w:ascii="Consolas" w:eastAsia="新細明體" w:hAnsi="Consolas" w:cs="新細明體"/>
+          <w:color w:val="0451A5"/>
+          <w:kern w:val="0"/>
+          <w:sz w:val="18"/>
+          <w:szCs w:val="18"/>
+        </w:rPr>
+        <w:t>-004"</w:t>
+      </w:r>
+      <w:r>
+        <w:rPr>
+          <w:rFonts w:ascii="Consolas" w:eastAsia="新細明體" w:hAnsi="Consolas" w:cs="新細明體"/>
+          <w:color w:val="000000"/>
+          <w:kern w:val="0"/>
+          <w:sz w:val="18"/>
+          <w:szCs w:val="18"/>
+        </w:rPr>
+        <w:t>,</w:t>
+      </w:r>
     </w:p>
     <w:p>
       <w:pPr>
@@ -14027,18 +14111,74 @@
         <w:shd w:val="clear" w:color="auto" w:fill="FFFFFE"/>
         <w:spacing w:line="270" w:lineRule="atLeast"/>
         <w:rPr>
-          <w:rFonts w:ascii="標楷體" w:eastAsia="標楷體" w:hAnsi="標楷體" w:cs="Helvetica"/>
-          <w:szCs w:val="18"/>
-          <w:shd w:val="clear" w:color="auto" w:fill="FFFFFF"/>
-        </w:rPr>
-      </w:pPr>
-      <w:r>
-        <w:rPr>
-          <w:rFonts w:ascii="標楷體" w:eastAsia="標楷體" w:hAnsi="標楷體" w:cs="Helvetica" w:hint="eastAsia"/>
-          <w:szCs w:val="18"/>
-          <w:shd w:val="clear" w:color="auto" w:fill="FFFFFF"/>
-        </w:rPr>
-        <w:t>Response:</w:t>
+          <w:rFonts w:ascii="Consolas" w:eastAsia="新細明體" w:hAnsi="Consolas" w:cs="新細明體"/>
+          <w:color w:val="000000"/>
+          <w:kern w:val="0"/>
+          <w:sz w:val="18"/>
+          <w:szCs w:val="18"/>
+        </w:rPr>
+      </w:pPr>
+      <w:r>
+        <w:rPr>
+          <w:rFonts w:ascii="Consolas" w:eastAsia="新細明體" w:hAnsi="Consolas" w:cs="新細明體"/>
+          <w:color w:val="000000"/>
+          <w:kern w:val="0"/>
+          <w:sz w:val="18"/>
+          <w:szCs w:val="18"/>
+        </w:rPr>
+        <w:t>    </w:t>
+      </w:r>
+      <w:r>
+        <w:rPr>
+          <w:rFonts w:ascii="Consolas" w:eastAsia="新細明體" w:hAnsi="Consolas" w:cs="新細明體"/>
+          <w:color w:val="A31515"/>
+          <w:kern w:val="0"/>
+          <w:sz w:val="18"/>
+          <w:szCs w:val="18"/>
+        </w:rPr>
+        <w:t>"</w:t>
+      </w:r>
+      <w:proofErr w:type="gramStart"/>
+      <w:r>
+        <w:rPr>
+          <w:rFonts w:ascii="Consolas" w:eastAsia="新細明體" w:hAnsi="Consolas" w:cs="新細明體"/>
+          <w:color w:val="A31515"/>
+          <w:kern w:val="0"/>
+          <w:sz w:val="18"/>
+          <w:szCs w:val="18"/>
+        </w:rPr>
+        <w:t>mapping</w:t>
+      </w:r>
+      <w:proofErr w:type="gramEnd"/>
+      <w:r>
+        <w:rPr>
+          <w:rFonts w:ascii="Consolas" w:eastAsia="新細明體" w:hAnsi="Consolas" w:cs="新細明體"/>
+          <w:color w:val="A31515"/>
+          <w:kern w:val="0"/>
+          <w:sz w:val="18"/>
+          <w:szCs w:val="18"/>
+        </w:rPr>
+        <w:t>"</w:t>
+      </w:r>
+      <w:r>
+        <w:rPr>
+          <w:rFonts w:ascii="Consolas" w:eastAsia="新細明體" w:hAnsi="Consolas" w:cs="新細明體"/>
+          <w:color w:val="000000"/>
+          <w:kern w:val="0"/>
+          <w:sz w:val="18"/>
+          <w:szCs w:val="18"/>
+        </w:rPr>
+        <w:t>: </w:t>
+      </w:r>
+      <w:r>
+        <w:rPr>
+          <w:rFonts w:ascii="Consolas" w:eastAsia="新細明體" w:hAnsi="Consolas" w:cs="新細明體"/>
+          <w:color w:val="0451A5"/>
+          <w:kern w:val="0"/>
+          <w:sz w:val="18"/>
+          <w:szCs w:val="18"/>
+        </w:rPr>
+        <w:t>"1231412"</w:t>
       </w:r>
     </w:p>
     <w:p>
@@ -14047,19 +14187,25 @@
         <w:shd w:val="clear" w:color="auto" w:fill="FFFFFE"/>
         <w:spacing w:line="270" w:lineRule="atLeast"/>
         <w:rPr>
-          <w:rFonts w:ascii="標楷體" w:eastAsia="標楷體" w:hAnsi="標楷體" w:cs="Helvetica"/>
-          <w:szCs w:val="18"/>
-          <w:shd w:val="clear" w:color="auto" w:fill="FFFFFF"/>
-        </w:rPr>
-      </w:pPr>
-      <w:r>
-        <w:rPr>
-          <w:rFonts w:ascii="標楷體" w:eastAsia="標楷體" w:hAnsi="標楷體" w:cs="Helvetica" w:hint="eastAsia"/>
-          <w:szCs w:val="18"/>
-          <w:shd w:val="clear" w:color="auto" w:fill="FFFFFF"/>
-        </w:rPr>
-        <w:t>成功</w:t>
-      </w:r>
+          <w:rFonts w:ascii="Consolas" w:eastAsia="新細明體" w:hAnsi="Consolas" w:cs="新細明體"/>
+          <w:color w:val="000000"/>
+          <w:kern w:val="0"/>
+          <w:sz w:val="18"/>
+          <w:szCs w:val="18"/>
+        </w:rPr>
+      </w:pPr>
+      <w:r>
+        <w:rPr>
+          <w:rFonts w:ascii="Consolas" w:eastAsia="新細明體" w:hAnsi="Consolas" w:cs="新細明體"/>
+          <w:color w:val="000000"/>
+          <w:kern w:val="0"/>
+          <w:sz w:val="18"/>
+          <w:szCs w:val="18"/>
+        </w:rPr>
+        <w:t>}</w:t>
+      </w:r>
+      <w:bookmarkStart w:id="0" w:name="_GoBack"/>
+      <w:bookmarkEnd w:id="0"/>
     </w:p>
     <w:p>
       <w:pPr>
@@ -14074,16 +14220,6 @@
           <w:szCs w:val="18"/>
         </w:rPr>
       </w:pPr>
-      <w:r>
-        <w:rPr>
-          <w:rFonts w:ascii="Consolas" w:eastAsia="新細明體" w:hAnsi="Consolas" w:cs="新細明體"/>
-          <w:color w:val="000000"/>
-          <w:kern w:val="0"/>
-          <w:sz w:val="18"/>
-          <w:szCs w:val="18"/>
-        </w:rPr>
-        <w:t>{</w:t>
-      </w:r>
     </w:p>
     <w:p>
       <w:pPr>
@@ -14091,86 +14227,18 @@
         <w:shd w:val="clear" w:color="auto" w:fill="FFFFFE"/>
         <w:spacing w:line="270" w:lineRule="atLeast"/>
         <w:rPr>
-          <w:rFonts w:ascii="Consolas" w:eastAsia="新細明體" w:hAnsi="Consolas" w:cs="新細明體"/>
-          <w:color w:val="000000"/>
-          <w:kern w:val="0"/>
-          <w:sz w:val="18"/>
-          <w:szCs w:val="18"/>
-        </w:rPr>
-      </w:pPr>
-      <w:r>
-        <w:rPr>
-          <w:rFonts w:ascii="Consolas" w:eastAsia="新細明體" w:hAnsi="Consolas" w:cs="新細明體"/>
-          <w:color w:val="000000"/>
-          <w:kern w:val="0"/>
-          <w:sz w:val="18"/>
-          <w:szCs w:val="18"/>
-        </w:rPr>
-        <w:t>    </w:t>
-      </w:r>
-      <w:r>
-        <w:rPr>
-          <w:rFonts w:ascii="Consolas" w:eastAsia="新細明體" w:hAnsi="Consolas" w:cs="新細明體"/>
-          <w:color w:val="A31515"/>
-          <w:kern w:val="0"/>
-          <w:sz w:val="18"/>
-          <w:szCs w:val="18"/>
-        </w:rPr>
-        <w:t>"</w:t>
-      </w:r>
-      <w:proofErr w:type="spellStart"/>
-      <w:proofErr w:type="gramStart"/>
-      <w:r>
-        <w:rPr>
-          <w:rFonts w:ascii="Consolas" w:eastAsia="新細明體" w:hAnsi="Consolas" w:cs="新細明體"/>
-          <w:color w:val="A31515"/>
-          <w:kern w:val="0"/>
-          <w:sz w:val="18"/>
-          <w:szCs w:val="18"/>
-        </w:rPr>
-        <w:t>codeStatus</w:t>
-      </w:r>
-      <w:proofErr w:type="spellEnd"/>
-      <w:proofErr w:type="gramEnd"/>
-      <w:r>
-        <w:rPr>
-          <w:rFonts w:ascii="Consolas" w:eastAsia="新細明體" w:hAnsi="Consolas" w:cs="新細明體"/>
-          <w:color w:val="A31515"/>
-          <w:kern w:val="0"/>
-          <w:sz w:val="18"/>
-          <w:szCs w:val="18"/>
-        </w:rPr>
-        <w:t>"</w:t>
-      </w:r>
-      <w:r>
-        <w:rPr>
-          <w:rFonts w:ascii="Consolas" w:eastAsia="新細明體" w:hAnsi="Consolas" w:cs="新細明體"/>
-          <w:color w:val="000000"/>
-          <w:kern w:val="0"/>
-          <w:sz w:val="18"/>
-          <w:szCs w:val="18"/>
-        </w:rPr>
-        <w:t>: </w:t>
-      </w:r>
-      <w:r>
-        <w:rPr>
-          <w:rFonts w:ascii="Consolas" w:eastAsia="新細明體" w:hAnsi="Consolas" w:cs="新細明體"/>
-          <w:color w:val="098658"/>
-          <w:kern w:val="0"/>
-          <w:sz w:val="18"/>
-          <w:szCs w:val="18"/>
-        </w:rPr>
-        <w:t>200</w:t>
-      </w:r>
-      <w:r>
-        <w:rPr>
-          <w:rFonts w:ascii="Consolas" w:eastAsia="新細明體" w:hAnsi="Consolas" w:cs="新細明體"/>
-          <w:color w:val="000000"/>
-          <w:kern w:val="0"/>
-          <w:sz w:val="18"/>
-          <w:szCs w:val="18"/>
-        </w:rPr>
-        <w:t>,</w:t>
+          <w:rFonts w:ascii="標楷體" w:eastAsia="標楷體" w:hAnsi="標楷體" w:cs="Helvetica"/>
+          <w:szCs w:val="18"/>
+          <w:shd w:val="clear" w:color="auto" w:fill="FFFFFF"/>
+        </w:rPr>
+      </w:pPr>
+      <w:r>
+        <w:rPr>
+          <w:rFonts w:ascii="標楷體" w:eastAsia="標楷體" w:hAnsi="標楷體" w:cs="Helvetica" w:hint="eastAsia"/>
+          <w:szCs w:val="18"/>
+          <w:shd w:val="clear" w:color="auto" w:fill="FFFFFF"/>
+        </w:rPr>
+        <w:t>Response:</w:t>
       </w:r>
     </w:p>
     <w:p>
@@ -14179,128 +14247,18 @@
         <w:shd w:val="clear" w:color="auto" w:fill="FFFFFE"/>
         <w:spacing w:line="270" w:lineRule="atLeast"/>
         <w:rPr>
-          <w:rFonts w:ascii="Consolas" w:eastAsia="新細明體" w:hAnsi="Consolas" w:cs="新細明體"/>
-          <w:color w:val="000000"/>
-          <w:kern w:val="0"/>
-          <w:sz w:val="18"/>
-          <w:szCs w:val="18"/>
-        </w:rPr>
-      </w:pPr>
-      <w:r>
-        <w:rPr>
-          <w:rFonts w:ascii="Consolas" w:eastAsia="新細明體" w:hAnsi="Consolas" w:cs="新細明體"/>
-          <w:color w:val="000000"/>
-          <w:kern w:val="0"/>
-          <w:sz w:val="18"/>
-          <w:szCs w:val="18"/>
-        </w:rPr>
-        <w:t>    </w:t>
-      </w:r>
-      <w:r>
-        <w:rPr>
-          <w:rFonts w:ascii="Consolas" w:eastAsia="新細明體" w:hAnsi="Consolas" w:cs="新細明體"/>
-          <w:color w:val="A31515"/>
-          <w:kern w:val="0"/>
-          <w:sz w:val="18"/>
-          <w:szCs w:val="18"/>
-        </w:rPr>
-        <w:t>"</w:t>
-      </w:r>
-      <w:proofErr w:type="gramStart"/>
-      <w:r>
-        <w:rPr>
-          <w:rFonts w:ascii="Consolas" w:eastAsia="新細明體" w:hAnsi="Consolas" w:cs="新細明體"/>
-          <w:color w:val="A31515"/>
-          <w:kern w:val="0"/>
-          <w:sz w:val="18"/>
-          <w:szCs w:val="18"/>
-        </w:rPr>
-        <w:t>message</w:t>
-      </w:r>
-      <w:proofErr w:type="gramEnd"/>
-      <w:r>
-        <w:rPr>
-          <w:rFonts w:ascii="Consolas" w:eastAsia="新細明體" w:hAnsi="Consolas" w:cs="新細明體"/>
-          <w:color w:val="A31515"/>
-          <w:kern w:val="0"/>
-          <w:sz w:val="18"/>
-          <w:szCs w:val="18"/>
-        </w:rPr>
-        <w:t>"</w:t>
-      </w:r>
-      <w:r>
-        <w:rPr>
-          <w:rFonts w:ascii="Consolas" w:eastAsia="新細明體" w:hAnsi="Consolas" w:cs="新細明體"/>
-          <w:color w:val="000000"/>
-          <w:kern w:val="0"/>
-          <w:sz w:val="18"/>
-          <w:szCs w:val="18"/>
-        </w:rPr>
-        <w:t>: </w:t>
-      </w:r>
-      <w:r>
-        <w:rPr>
-          <w:rFonts w:ascii="Consolas" w:eastAsia="新細明體" w:hAnsi="Consolas" w:cs="新細明體"/>
-          <w:color w:val="0451A5"/>
-          <w:kern w:val="0"/>
-          <w:sz w:val="18"/>
-          <w:szCs w:val="18"/>
-        </w:rPr>
-        <w:t>"Update </w:t>
-      </w:r>
-      <w:proofErr w:type="spellStart"/>
-      <w:r>
-        <w:rPr>
-          <w:rFonts w:ascii="Consolas" w:eastAsia="新細明體" w:hAnsi="Consolas" w:cs="新細明體"/>
-          <w:color w:val="0451A5"/>
-          <w:kern w:val="0"/>
-          <w:sz w:val="18"/>
-          <w:szCs w:val="18"/>
-        </w:rPr>
-        <w:t>TourCarCase</w:t>
-      </w:r>
-      <w:proofErr w:type="spellEnd"/>
-      <w:r>
-        <w:rPr>
-          <w:rFonts w:ascii="Consolas" w:eastAsia="新細明體" w:hAnsi="Consolas" w:cs="新細明體"/>
-          <w:color w:val="0451A5"/>
-          <w:kern w:val="0"/>
-          <w:sz w:val="18"/>
-          <w:szCs w:val="18"/>
-        </w:rPr>
-        <w:t> Record </w:t>
-      </w:r>
-      <w:proofErr w:type="spellStart"/>
-      <w:r>
-        <w:rPr>
-          <w:rFonts w:ascii="Consolas" w:eastAsia="新細明體" w:hAnsi="Consolas" w:cs="新細明體"/>
-          <w:color w:val="0451A5"/>
-          <w:kern w:val="0"/>
-          <w:sz w:val="18"/>
-          <w:szCs w:val="18"/>
-        </w:rPr>
-        <w:t>caseName</w:t>
-      </w:r>
-      <w:proofErr w:type="spellEnd"/>
-      <w:r>
-        <w:rPr>
-          <w:rFonts w:ascii="Consolas" w:eastAsia="新細明體" w:hAnsi="Consolas" w:cs="新細明體"/>
-          <w:color w:val="0451A5"/>
-          <w:kern w:val="0"/>
-          <w:sz w:val="18"/>
-          <w:szCs w:val="18"/>
-        </w:rPr>
-        <w:t>: caseName3."</w:t>
-      </w:r>
-      <w:r>
-        <w:rPr>
-          <w:rFonts w:ascii="Consolas" w:eastAsia="新細明體" w:hAnsi="Consolas" w:cs="新細明體"/>
-          <w:color w:val="000000"/>
-          <w:kern w:val="0"/>
-          <w:sz w:val="18"/>
-          <w:szCs w:val="18"/>
-        </w:rPr>
-        <w:t>,</w:t>
+          <w:rFonts w:ascii="標楷體" w:eastAsia="標楷體" w:hAnsi="標楷體" w:cs="Helvetica"/>
+          <w:szCs w:val="18"/>
+          <w:shd w:val="clear" w:color="auto" w:fill="FFFFFF"/>
+        </w:rPr>
+      </w:pPr>
+      <w:r>
+        <w:rPr>
+          <w:rFonts w:ascii="標楷體" w:eastAsia="標楷體" w:hAnsi="標楷體" w:cs="Helvetica" w:hint="eastAsia"/>
+          <w:szCs w:val="18"/>
+          <w:shd w:val="clear" w:color="auto" w:fill="FFFFFF"/>
+        </w:rPr>
+        <w:t>成功</w:t>
       </w:r>
     </w:p>
     <w:p>
@@ -14324,49 +14282,7 @@
           <w:sz w:val="18"/>
           <w:szCs w:val="18"/>
         </w:rPr>
-        <w:t>    </w:t>
-      </w:r>
-      <w:r>
-        <w:rPr>
-          <w:rFonts w:ascii="Consolas" w:eastAsia="新細明體" w:hAnsi="Consolas" w:cs="新細明體"/>
-          <w:color w:val="A31515"/>
-          <w:kern w:val="0"/>
-          <w:sz w:val="18"/>
-          <w:szCs w:val="18"/>
-        </w:rPr>
-        <w:t>"</w:t>
-      </w:r>
-      <w:proofErr w:type="gramStart"/>
-      <w:r>
-        <w:rPr>
-          <w:rFonts w:ascii="Consolas" w:eastAsia="新細明體" w:hAnsi="Consolas" w:cs="新細明體"/>
-          <w:color w:val="A31515"/>
-          <w:kern w:val="0"/>
-          <w:sz w:val="18"/>
-          <w:szCs w:val="18"/>
-        </w:rPr>
-        <w:t>result</w:t>
-      </w:r>
-      <w:proofErr w:type="gramEnd"/>
-      <w:r>
-        <w:rPr>
-          <w:rFonts w:ascii="Consolas" w:eastAsia="新細明體" w:hAnsi="Consolas" w:cs="新細明體"/>
-          <w:color w:val="A31515"/>
-          <w:kern w:val="0"/>
-          <w:sz w:val="18"/>
-          <w:szCs w:val="18"/>
-        </w:rPr>
-        <w:t>"</w:t>
-      </w:r>
-      <w:r>
-        <w:rPr>
-          <w:rFonts w:ascii="Consolas" w:eastAsia="新細明體" w:hAnsi="Consolas" w:cs="新細明體"/>
-          <w:color w:val="000000"/>
-          <w:kern w:val="0"/>
-          <w:sz w:val="18"/>
-          <w:szCs w:val="18"/>
-        </w:rPr>
-        <w:t>: {</w:t>
+        <w:t>{</w:t>
       </w:r>
     </w:p>
     <w:p>
@@ -14390,7 +14306,7 @@
           <w:sz w:val="18"/>
           <w:szCs w:val="18"/>
         </w:rPr>
-        <w:t>        </w:t>
+        <w:t>    </w:t>
       </w:r>
       <w:r>
         <w:rPr>
@@ -14402,6 +14318,7 @@
         </w:rPr>
         <w:t>"</w:t>
       </w:r>
+      <w:proofErr w:type="spellStart"/>
       <w:proofErr w:type="gramStart"/>
       <w:r>
         <w:rPr>
@@ -14411,8 +14328,9 @@
           <w:sz w:val="18"/>
           <w:szCs w:val="18"/>
         </w:rPr>
-        <w:t>id</w:t>
-      </w:r>
+        <w:t>codeStatus</w:t>
+      </w:r>
+      <w:proofErr w:type="spellEnd"/>
       <w:proofErr w:type="gramEnd"/>
       <w:r>
         <w:rPr>
@@ -14437,12 +14355,12 @@
       <w:r>
         <w:rPr>
           <w:rFonts w:ascii="Consolas" w:eastAsia="新細明體" w:hAnsi="Consolas" w:cs="新細明體"/>
-          <w:color w:val="0451A5"/>
-          <w:kern w:val="0"/>
-          <w:sz w:val="18"/>
-          <w:szCs w:val="18"/>
-        </w:rPr>
-        <w:t>"1"</w:t>
+          <w:color w:val="098658"/>
+          <w:kern w:val="0"/>
+          <w:sz w:val="18"/>
+          <w:szCs w:val="18"/>
+        </w:rPr>
+        <w:t>200</w:t>
       </w:r>
       <w:r>
         <w:rPr>
@@ -14476,7 +14394,7 @@
           <w:sz w:val="18"/>
           <w:szCs w:val="18"/>
         </w:rPr>
-        <w:t>        </w:t>
+        <w:t>    </w:t>
       </w:r>
       <w:r>
         <w:rPr>
@@ -14488,40 +14406,60 @@
         </w:rPr>
         <w:t>"</w:t>
       </w:r>
+      <w:proofErr w:type="gramStart"/>
+      <w:r>
+        <w:rPr>
+          <w:rFonts w:ascii="Consolas" w:eastAsia="新細明體" w:hAnsi="Consolas" w:cs="新細明體"/>
+          <w:color w:val="A31515"/>
+          <w:kern w:val="0"/>
+          <w:sz w:val="18"/>
+          <w:szCs w:val="18"/>
+        </w:rPr>
+        <w:t>message</w:t>
+      </w:r>
+      <w:proofErr w:type="gramEnd"/>
+      <w:r>
+        <w:rPr>
+          <w:rFonts w:ascii="Consolas" w:eastAsia="新細明體" w:hAnsi="Consolas" w:cs="新細明體"/>
+          <w:color w:val="A31515"/>
+          <w:kern w:val="0"/>
+          <w:sz w:val="18"/>
+          <w:szCs w:val="18"/>
+        </w:rPr>
+        <w:t>"</w:t>
+      </w:r>
+      <w:r>
+        <w:rPr>
+          <w:rFonts w:ascii="Consolas" w:eastAsia="新細明體" w:hAnsi="Consolas" w:cs="新細明體"/>
+          <w:color w:val="000000"/>
+          <w:kern w:val="0"/>
+          <w:sz w:val="18"/>
+          <w:szCs w:val="18"/>
+        </w:rPr>
+        <w:t>: </w:t>
+      </w:r>
+      <w:r>
+        <w:rPr>
+          <w:rFonts w:ascii="Consolas" w:eastAsia="新細明體" w:hAnsi="Consolas" w:cs="新細明體"/>
+          <w:color w:val="0451A5"/>
+          <w:kern w:val="0"/>
+          <w:sz w:val="18"/>
+          <w:szCs w:val="18"/>
+        </w:rPr>
+        <w:t>"Update </w:t>
+      </w:r>
       <w:proofErr w:type="spellStart"/>
-      <w:proofErr w:type="gramStart"/>
-      <w:r>
-        <w:rPr>
-          <w:rFonts w:ascii="Consolas" w:eastAsia="新細明體" w:hAnsi="Consolas" w:cs="新細明體"/>
-          <w:color w:val="A31515"/>
-          <w:kern w:val="0"/>
-          <w:sz w:val="18"/>
-          <w:szCs w:val="18"/>
-        </w:rPr>
-        <w:t>patientId</w:t>
+      <w:r>
+        <w:rPr>
+          <w:rFonts w:ascii="Consolas" w:eastAsia="新細明體" w:hAnsi="Consolas" w:cs="新細明體"/>
+          <w:color w:val="0451A5"/>
+          <w:kern w:val="0"/>
+          <w:sz w:val="18"/>
+          <w:szCs w:val="18"/>
+        </w:rPr>
+        <w:t>TourCarCase</w:t>
       </w:r>
       <w:proofErr w:type="spellEnd"/>
-      <w:proofErr w:type="gramEnd"/>
-      <w:r>
-        <w:rPr>
-          <w:rFonts w:ascii="Consolas" w:eastAsia="新細明體" w:hAnsi="Consolas" w:cs="新細明體"/>
-          <w:color w:val="A31515"/>
-          <w:kern w:val="0"/>
-          <w:sz w:val="18"/>
-          <w:szCs w:val="18"/>
-        </w:rPr>
-        <w:t>"</w:t>
-      </w:r>
-      <w:r>
-        <w:rPr>
-          <w:rFonts w:ascii="Consolas" w:eastAsia="新細明體" w:hAnsi="Consolas" w:cs="新細明體"/>
-          <w:color w:val="000000"/>
-          <w:kern w:val="0"/>
-          <w:sz w:val="18"/>
-          <w:szCs w:val="18"/>
-        </w:rPr>
-        <w:t>: </w:t>
-      </w:r>
       <w:r>
         <w:rPr>
           <w:rFonts w:ascii="Consolas" w:eastAsia="新細明體" w:hAnsi="Consolas" w:cs="新細明體"/>
@@ -14530,7 +14468,29 @@
           <w:sz w:val="18"/>
           <w:szCs w:val="18"/>
         </w:rPr>
-        <w:t>"1234"</w:t>
+        <w:t> Record </w:t>
+      </w:r>
+      <w:proofErr w:type="spellStart"/>
+      <w:r>
+        <w:rPr>
+          <w:rFonts w:ascii="Consolas" w:eastAsia="新細明體" w:hAnsi="Consolas" w:cs="新細明體"/>
+          <w:color w:val="0451A5"/>
+          <w:kern w:val="0"/>
+          <w:sz w:val="18"/>
+          <w:szCs w:val="18"/>
+        </w:rPr>
+        <w:t>caseName</w:t>
+      </w:r>
+      <w:proofErr w:type="spellEnd"/>
+      <w:r>
+        <w:rPr>
+          <w:rFonts w:ascii="Consolas" w:eastAsia="新細明體" w:hAnsi="Consolas" w:cs="新細明體"/>
+          <w:color w:val="0451A5"/>
+          <w:kern w:val="0"/>
+          <w:sz w:val="18"/>
+          <w:szCs w:val="18"/>
+        </w:rPr>
+        <w:t>: caseName3."</w:t>
       </w:r>
       <w:r>
         <w:rPr>
@@ -14542,8 +14502,6 @@
         </w:rPr>
         <w:t>,</w:t>
       </w:r>
-      <w:bookmarkStart w:id="0" w:name="_GoBack"/>
-      <w:bookmarkEnd w:id="0"/>
     </w:p>
     <w:p>
       <w:pPr>
@@ -14567,6 +14525,246 @@
           <w:szCs w:val="18"/>
         </w:rPr>
         <w:lastRenderedPageBreak/>
+        <w:t>    </w:t>
+      </w:r>
+      <w:r>
+        <w:rPr>
+          <w:rFonts w:ascii="Consolas" w:eastAsia="新細明體" w:hAnsi="Consolas" w:cs="新細明體"/>
+          <w:color w:val="A31515"/>
+          <w:kern w:val="0"/>
+          <w:sz w:val="18"/>
+          <w:szCs w:val="18"/>
+        </w:rPr>
+        <w:t>"</w:t>
+      </w:r>
+      <w:proofErr w:type="gramStart"/>
+      <w:r>
+        <w:rPr>
+          <w:rFonts w:ascii="Consolas" w:eastAsia="新細明體" w:hAnsi="Consolas" w:cs="新細明體"/>
+          <w:color w:val="A31515"/>
+          <w:kern w:val="0"/>
+          <w:sz w:val="18"/>
+          <w:szCs w:val="18"/>
+        </w:rPr>
+        <w:t>result</w:t>
+      </w:r>
+      <w:proofErr w:type="gramEnd"/>
+      <w:r>
+        <w:rPr>
+          <w:rFonts w:ascii="Consolas" w:eastAsia="新細明體" w:hAnsi="Consolas" w:cs="新細明體"/>
+          <w:color w:val="A31515"/>
+          <w:kern w:val="0"/>
+          <w:sz w:val="18"/>
+          <w:szCs w:val="18"/>
+        </w:rPr>
+        <w:t>"</w:t>
+      </w:r>
+      <w:r>
+        <w:rPr>
+          <w:rFonts w:ascii="Consolas" w:eastAsia="新細明體" w:hAnsi="Consolas" w:cs="新細明體"/>
+          <w:color w:val="000000"/>
+          <w:kern w:val="0"/>
+          <w:sz w:val="18"/>
+          <w:szCs w:val="18"/>
+        </w:rPr>
+        <w:t>: {</w:t>
+      </w:r>
+    </w:p>
+    <w:p>
+      <w:pPr>
+        <w:widowControl/>
+        <w:shd w:val="clear" w:color="auto" w:fill="FFFFFE"/>
+        <w:spacing w:line="270" w:lineRule="atLeast"/>
+        <w:rPr>
+          <w:rFonts w:ascii="Consolas" w:eastAsia="新細明體" w:hAnsi="Consolas" w:cs="新細明體"/>
+          <w:color w:val="000000"/>
+          <w:kern w:val="0"/>
+          <w:sz w:val="18"/>
+          <w:szCs w:val="18"/>
+        </w:rPr>
+      </w:pPr>
+      <w:r>
+        <w:rPr>
+          <w:rFonts w:ascii="Consolas" w:eastAsia="新細明體" w:hAnsi="Consolas" w:cs="新細明體"/>
+          <w:color w:val="000000"/>
+          <w:kern w:val="0"/>
+          <w:sz w:val="18"/>
+          <w:szCs w:val="18"/>
+        </w:rPr>
+        <w:t>        </w:t>
+      </w:r>
+      <w:r>
+        <w:rPr>
+          <w:rFonts w:ascii="Consolas" w:eastAsia="新細明體" w:hAnsi="Consolas" w:cs="新細明體"/>
+          <w:color w:val="A31515"/>
+          <w:kern w:val="0"/>
+          <w:sz w:val="18"/>
+          <w:szCs w:val="18"/>
+        </w:rPr>
+        <w:t>"</w:t>
+      </w:r>
+      <w:proofErr w:type="gramStart"/>
+      <w:r>
+        <w:rPr>
+          <w:rFonts w:ascii="Consolas" w:eastAsia="新細明體" w:hAnsi="Consolas" w:cs="新細明體"/>
+          <w:color w:val="A31515"/>
+          <w:kern w:val="0"/>
+          <w:sz w:val="18"/>
+          <w:szCs w:val="18"/>
+        </w:rPr>
+        <w:t>id</w:t>
+      </w:r>
+      <w:proofErr w:type="gramEnd"/>
+      <w:r>
+        <w:rPr>
+          <w:rFonts w:ascii="Consolas" w:eastAsia="新細明體" w:hAnsi="Consolas" w:cs="新細明體"/>
+          <w:color w:val="A31515"/>
+          <w:kern w:val="0"/>
+          <w:sz w:val="18"/>
+          <w:szCs w:val="18"/>
+        </w:rPr>
+        <w:t>"</w:t>
+      </w:r>
+      <w:r>
+        <w:rPr>
+          <w:rFonts w:ascii="Consolas" w:eastAsia="新細明體" w:hAnsi="Consolas" w:cs="新細明體"/>
+          <w:color w:val="000000"/>
+          <w:kern w:val="0"/>
+          <w:sz w:val="18"/>
+          <w:szCs w:val="18"/>
+        </w:rPr>
+        <w:t>: </w:t>
+      </w:r>
+      <w:r>
+        <w:rPr>
+          <w:rFonts w:ascii="Consolas" w:eastAsia="新細明體" w:hAnsi="Consolas" w:cs="新細明體"/>
+          <w:color w:val="0451A5"/>
+          <w:kern w:val="0"/>
+          <w:sz w:val="18"/>
+          <w:szCs w:val="18"/>
+        </w:rPr>
+        <w:t>"1"</w:t>
+      </w:r>
+      <w:r>
+        <w:rPr>
+          <w:rFonts w:ascii="Consolas" w:eastAsia="新細明體" w:hAnsi="Consolas" w:cs="新細明體"/>
+          <w:color w:val="000000"/>
+          <w:kern w:val="0"/>
+          <w:sz w:val="18"/>
+          <w:szCs w:val="18"/>
+        </w:rPr>
+        <w:t>,</w:t>
+      </w:r>
+    </w:p>
+    <w:p>
+      <w:pPr>
+        <w:widowControl/>
+        <w:shd w:val="clear" w:color="auto" w:fill="FFFFFE"/>
+        <w:spacing w:line="270" w:lineRule="atLeast"/>
+        <w:rPr>
+          <w:rFonts w:ascii="Consolas" w:eastAsia="新細明體" w:hAnsi="Consolas" w:cs="新細明體"/>
+          <w:color w:val="000000"/>
+          <w:kern w:val="0"/>
+          <w:sz w:val="18"/>
+          <w:szCs w:val="18"/>
+        </w:rPr>
+      </w:pPr>
+      <w:r>
+        <w:rPr>
+          <w:rFonts w:ascii="Consolas" w:eastAsia="新細明體" w:hAnsi="Consolas" w:cs="新細明體"/>
+          <w:color w:val="000000"/>
+          <w:kern w:val="0"/>
+          <w:sz w:val="18"/>
+          <w:szCs w:val="18"/>
+        </w:rPr>
+        <w:t>        </w:t>
+      </w:r>
+      <w:r>
+        <w:rPr>
+          <w:rFonts w:ascii="Consolas" w:eastAsia="新細明體" w:hAnsi="Consolas" w:cs="新細明體"/>
+          <w:color w:val="A31515"/>
+          <w:kern w:val="0"/>
+          <w:sz w:val="18"/>
+          <w:szCs w:val="18"/>
+        </w:rPr>
+        <w:t>"</w:t>
+      </w:r>
+      <w:proofErr w:type="spellStart"/>
+      <w:proofErr w:type="gramStart"/>
+      <w:r>
+        <w:rPr>
+          <w:rFonts w:ascii="Consolas" w:eastAsia="新細明體" w:hAnsi="Consolas" w:cs="新細明體"/>
+          <w:color w:val="A31515"/>
+          <w:kern w:val="0"/>
+          <w:sz w:val="18"/>
+          <w:szCs w:val="18"/>
+        </w:rPr>
+        <w:t>patientId</w:t>
+      </w:r>
+      <w:proofErr w:type="spellEnd"/>
+      <w:proofErr w:type="gramEnd"/>
+      <w:r>
+        <w:rPr>
+          <w:rFonts w:ascii="Consolas" w:eastAsia="新細明體" w:hAnsi="Consolas" w:cs="新細明體"/>
+          <w:color w:val="A31515"/>
+          <w:kern w:val="0"/>
+          <w:sz w:val="18"/>
+          <w:szCs w:val="18"/>
+        </w:rPr>
+        <w:t>"</w:t>
+      </w:r>
+      <w:r>
+        <w:rPr>
+          <w:rFonts w:ascii="Consolas" w:eastAsia="新細明體" w:hAnsi="Consolas" w:cs="新細明體"/>
+          <w:color w:val="000000"/>
+          <w:kern w:val="0"/>
+          <w:sz w:val="18"/>
+          <w:szCs w:val="18"/>
+        </w:rPr>
+        <w:t>: </w:t>
+      </w:r>
+      <w:r>
+        <w:rPr>
+          <w:rFonts w:ascii="Consolas" w:eastAsia="新細明體" w:hAnsi="Consolas" w:cs="新細明體"/>
+          <w:color w:val="0451A5"/>
+          <w:kern w:val="0"/>
+          <w:sz w:val="18"/>
+          <w:szCs w:val="18"/>
+        </w:rPr>
+        <w:t>"1234"</w:t>
+      </w:r>
+      <w:r>
+        <w:rPr>
+          <w:rFonts w:ascii="Consolas" w:eastAsia="新細明體" w:hAnsi="Consolas" w:cs="新細明體"/>
+          <w:color w:val="000000"/>
+          <w:kern w:val="0"/>
+          <w:sz w:val="18"/>
+          <w:szCs w:val="18"/>
+        </w:rPr>
+        <w:t>,</w:t>
+      </w:r>
+    </w:p>
+    <w:p>
+      <w:pPr>
+        <w:widowControl/>
+        <w:shd w:val="clear" w:color="auto" w:fill="FFFFFE"/>
+        <w:spacing w:line="270" w:lineRule="atLeast"/>
+        <w:rPr>
+          <w:rFonts w:ascii="Consolas" w:eastAsia="新細明體" w:hAnsi="Consolas" w:cs="新細明體"/>
+          <w:color w:val="000000"/>
+          <w:kern w:val="0"/>
+          <w:sz w:val="18"/>
+          <w:szCs w:val="18"/>
+        </w:rPr>
+      </w:pPr>
+      <w:r>
+        <w:rPr>
+          <w:rFonts w:ascii="Consolas" w:eastAsia="新細明體" w:hAnsi="Consolas" w:cs="新細明體"/>
+          <w:color w:val="000000"/>
+          <w:kern w:val="0"/>
+          <w:sz w:val="18"/>
+          <w:szCs w:val="18"/>
+        </w:rPr>
         <w:t>        </w:t>
       </w:r>
       <w:r>
@@ -16685,6 +16883,7 @@
           <w:sz w:val="18"/>
           <w:szCs w:val="18"/>
         </w:rPr>
+        <w:lastRenderedPageBreak/>
         <w:t>        </w:t>
       </w:r>
       <w:r>
@@ -16965,7 +17164,6 @@
           <w:sz w:val="18"/>
           <w:szCs w:val="18"/>
         </w:rPr>
-        <w:lastRenderedPageBreak/>
         <w:t>        </w:t>
       </w:r>
       <w:r>
@@ -19232,7 +19430,7 @@
         <w:shd w:val="clear" w:color="auto" w:fill="FFFFFE"/>
         <w:spacing w:line="270" w:lineRule="atLeast"/>
         <w:rPr>
-          <w:rFonts w:ascii="標楷體" w:eastAsia="標楷體" w:hAnsi="標楷體" w:cs="Helvetica" w:hint="eastAsia"/>
+          <w:rFonts w:ascii="標楷體" w:eastAsia="標楷體" w:hAnsi="標楷體" w:cs="Helvetica"/>
           <w:szCs w:val="18"/>
           <w:shd w:val="clear" w:color="auto" w:fill="FFFFFF"/>
         </w:rPr>
@@ -19253,7 +19451,7 @@
         <w:shd w:val="clear" w:color="auto" w:fill="FFFFFE"/>
         <w:spacing w:line="270" w:lineRule="atLeast"/>
         <w:rPr>
-          <w:rFonts w:ascii="標楷體" w:eastAsia="標楷體" w:hAnsi="標楷體" w:cs="Helvetica" w:hint="eastAsia"/>
+          <w:rFonts w:ascii="標楷體" w:eastAsia="標楷體" w:hAnsi="標楷體" w:cs="Helvetica"/>
           <w:szCs w:val="18"/>
           <w:shd w:val="clear" w:color="auto" w:fill="FFFFFF"/>
         </w:rPr>
@@ -19309,7 +19507,7 @@
         <w:shd w:val="clear" w:color="auto" w:fill="FFFFFE"/>
         <w:spacing w:line="270" w:lineRule="atLeast"/>
         <w:rPr>
-          <w:rFonts w:ascii="標楷體" w:eastAsia="標楷體" w:hAnsi="標楷體" w:cs="Helvetica" w:hint="eastAsia"/>
+          <w:rFonts w:ascii="標楷體" w:eastAsia="標楷體" w:hAnsi="標楷體" w:cs="Helvetica"/>
           <w:szCs w:val="18"/>
           <w:shd w:val="clear" w:color="auto" w:fill="FFFFFF"/>
         </w:rPr>
@@ -19329,7 +19527,7 @@
         <w:shd w:val="clear" w:color="auto" w:fill="FFFFFE"/>
         <w:spacing w:line="270" w:lineRule="atLeast"/>
         <w:rPr>
-          <w:rFonts w:ascii="標楷體" w:eastAsia="標楷體" w:hAnsi="標楷體" w:cs="Helvetica" w:hint="eastAsia"/>
+          <w:rFonts w:ascii="標楷體" w:eastAsia="標楷體" w:hAnsi="標楷體" w:cs="Helvetica"/>
           <w:szCs w:val="18"/>
           <w:shd w:val="clear" w:color="auto" w:fill="FFFFFF"/>
         </w:rPr>
@@ -19369,7 +19567,7 @@
         <w:shd w:val="clear" w:color="auto" w:fill="FFFFFE"/>
         <w:spacing w:line="270" w:lineRule="atLeast"/>
         <w:rPr>
-          <w:rFonts w:ascii="標楷體" w:eastAsia="標楷體" w:hAnsi="標楷體" w:cs="Helvetica" w:hint="eastAsia"/>
+          <w:rFonts w:ascii="標楷體" w:eastAsia="標楷體" w:hAnsi="標楷體" w:cs="Helvetica"/>
           <w:szCs w:val="18"/>
           <w:shd w:val="clear" w:color="auto" w:fill="FFFFFF"/>
         </w:rPr>
@@ -19683,7 +19881,7 @@
         <w:shd w:val="clear" w:color="auto" w:fill="FFFFFE"/>
         <w:spacing w:line="270" w:lineRule="atLeast"/>
         <w:rPr>
-          <w:rFonts w:ascii="標楷體" w:eastAsia="標楷體" w:hAnsi="標楷體" w:cs="Helvetica" w:hint="eastAsia"/>
+          <w:rFonts w:ascii="標楷體" w:eastAsia="標楷體" w:hAnsi="標楷體" w:cs="Helvetica"/>
           <w:szCs w:val="18"/>
           <w:shd w:val="clear" w:color="auto" w:fill="FFFFFF"/>
         </w:rPr>
@@ -19695,7 +19893,7 @@
         <w:shd w:val="clear" w:color="auto" w:fill="FFFFFE"/>
         <w:spacing w:line="270" w:lineRule="atLeast"/>
         <w:rPr>
-          <w:rFonts w:ascii="標楷體" w:eastAsia="標楷體" w:hAnsi="標楷體" w:cs="Helvetica" w:hint="eastAsia"/>
+          <w:rFonts w:ascii="標楷體" w:eastAsia="標楷體" w:hAnsi="標楷體" w:cs="Helvetica"/>
           <w:szCs w:val="18"/>
           <w:shd w:val="clear" w:color="auto" w:fill="FFFFFF"/>
         </w:rPr>
@@ -19760,94 +19958,70 @@
         <w:shd w:val="clear" w:color="auto" w:fill="FFFFFE"/>
         <w:spacing w:line="270" w:lineRule="atLeast"/>
         <w:rPr>
+          <w:rFonts w:ascii="標楷體" w:eastAsia="標楷體" w:hAnsi="標楷體" w:cs="Helvetica"/>
+          <w:szCs w:val="18"/>
+          <w:shd w:val="clear" w:color="auto" w:fill="FFFFFF"/>
+        </w:rPr>
+      </w:pPr>
+      <w:r>
+        <w:rPr>
+          <w:rFonts w:ascii="標楷體" w:eastAsia="標楷體" w:hAnsi="標楷體" w:cs="Helvetica"/>
+          <w:szCs w:val="18"/>
+          <w:shd w:val="clear" w:color="auto" w:fill="FFFFFF"/>
+        </w:rPr>
+        <w:t>[</w:t>
+      </w:r>
+      <w:r>
+        <w:rPr>
           <w:rFonts w:ascii="標楷體" w:eastAsia="標楷體" w:hAnsi="標楷體" w:cs="Helvetica" w:hint="eastAsia"/>
           <w:szCs w:val="18"/>
           <w:shd w:val="clear" w:color="auto" w:fill="FFFFFF"/>
         </w:rPr>
-      </w:pPr>
+        <w:t>POST</w:t>
+      </w:r>
       <w:r>
         <w:rPr>
           <w:rFonts w:ascii="標楷體" w:eastAsia="標楷體" w:hAnsi="標楷體" w:cs="Helvetica"/>
           <w:szCs w:val="18"/>
           <w:shd w:val="clear" w:color="auto" w:fill="FFFFFF"/>
         </w:rPr>
-        <w:t>[</w:t>
-      </w:r>
+        <w:t>] /</w:t>
+      </w:r>
+      <w:proofErr w:type="spellStart"/>
+      <w:r>
+        <w:rPr>
+          <w:rFonts w:ascii="標楷體" w:eastAsia="標楷體" w:hAnsi="標楷體" w:cs="Helvetica"/>
+          <w:szCs w:val="18"/>
+          <w:shd w:val="clear" w:color="auto" w:fill="FFFFFF"/>
+        </w:rPr>
+        <w:t>tourCarCase</w:t>
+      </w:r>
+      <w:proofErr w:type="spellEnd"/>
+      <w:r>
+        <w:rPr>
+          <w:rFonts w:ascii="標楷體" w:eastAsia="標楷體" w:hAnsi="標楷體" w:cs="Helvetica"/>
+          <w:szCs w:val="18"/>
+          <w:shd w:val="clear" w:color="auto" w:fill="FFFFFF"/>
+        </w:rPr>
+        <w:t>/:case/</w:t>
+      </w:r>
+      <w:proofErr w:type="spellStart"/>
+      <w:r>
+        <w:rPr>
+          <w:rFonts w:ascii="標楷體" w:eastAsia="標楷體" w:hAnsi="標楷體" w:cs="Helvetica"/>
+          <w:szCs w:val="18"/>
+          <w:shd w:val="clear" w:color="auto" w:fill="FFFFFF"/>
+        </w:rPr>
+        <w:t>retryPACS</w:t>
+      </w:r>
+      <w:proofErr w:type="spellEnd"/>
       <w:r>
         <w:rPr>
           <w:rFonts w:ascii="標楷體" w:eastAsia="標楷體" w:hAnsi="標楷體" w:cs="Helvetica" w:hint="eastAsia"/>
           <w:szCs w:val="18"/>
           <w:shd w:val="clear" w:color="auto" w:fill="FFFFFF"/>
         </w:rPr>
-        <w:t>POST</w:t>
-      </w:r>
-      <w:r>
-        <w:rPr>
-          <w:rFonts w:ascii="標楷體" w:eastAsia="標楷體" w:hAnsi="標楷體" w:cs="Helvetica"/>
-          <w:szCs w:val="18"/>
-          <w:shd w:val="clear" w:color="auto" w:fill="FFFFFF"/>
-        </w:rPr>
-        <w:t>] /</w:t>
-      </w:r>
-      <w:proofErr w:type="spellStart"/>
-      <w:r>
-        <w:rPr>
-          <w:rFonts w:ascii="標楷體" w:eastAsia="標楷體" w:hAnsi="標楷體" w:cs="Helvetica"/>
-          <w:szCs w:val="18"/>
-          <w:shd w:val="clear" w:color="auto" w:fill="FFFFFF"/>
-        </w:rPr>
-        <w:t>tourCarCase</w:t>
-      </w:r>
-      <w:proofErr w:type="spellEnd"/>
-      <w:r>
-        <w:rPr>
-          <w:rFonts w:ascii="標楷體" w:eastAsia="標楷體" w:hAnsi="標楷體" w:cs="Helvetica"/>
-          <w:szCs w:val="18"/>
-          <w:shd w:val="clear" w:color="auto" w:fill="FFFFFF"/>
-        </w:rPr>
-        <w:t>/:case/</w:t>
-      </w:r>
-      <w:proofErr w:type="spellStart"/>
-      <w:r>
-        <w:rPr>
-          <w:rFonts w:ascii="標楷體" w:eastAsia="標楷體" w:hAnsi="標楷體" w:cs="Helvetica"/>
-          <w:szCs w:val="18"/>
-          <w:shd w:val="clear" w:color="auto" w:fill="FFFFFF"/>
-        </w:rPr>
-        <w:t>retryPACS</w:t>
-      </w:r>
-      <w:proofErr w:type="spellEnd"/>
-      <w:r>
-        <w:rPr>
-          <w:rFonts w:ascii="標楷體" w:eastAsia="標楷體" w:hAnsi="標楷體" w:cs="Helvetica" w:hint="eastAsia"/>
-          <w:szCs w:val="18"/>
-          <w:shd w:val="clear" w:color="auto" w:fill="FFFFFF"/>
-        </w:rPr>
-        <w:t xml:space="preserve">   </w:t>
-      </w:r>
-      <w:r>
-        <w:rPr>
-          <w:rFonts w:ascii="標楷體" w:eastAsia="標楷體" w:hAnsi="標楷體" w:cs="Helvetica" w:hint="eastAsia"/>
-          <w:szCs w:val="18"/>
-          <w:shd w:val="clear" w:color="auto" w:fill="FFFFFF"/>
-        </w:rPr>
-        <w:t>(</w:t>
-      </w:r>
-      <w:r>
-        <w:rPr>
-          <w:rFonts w:ascii="標楷體" w:eastAsia="標楷體" w:hAnsi="標楷體" w:cs="Helvetica" w:hint="eastAsia"/>
-          <w:szCs w:val="18"/>
-          <w:shd w:val="clear" w:color="auto" w:fill="FFFFFF"/>
-        </w:rPr>
-        <w:t>模擬retry送給PACS</w:t>
-      </w:r>
-      <w:r>
-        <w:rPr>
-          <w:rFonts w:ascii="標楷體" w:eastAsia="標楷體" w:hAnsi="標楷體" w:cs="Helvetica" w:hint="eastAsia"/>
-          <w:szCs w:val="18"/>
-          <w:shd w:val="clear" w:color="auto" w:fill="FFFFFF"/>
-        </w:rPr>
-        <w:t>)</w:t>
+        <w:t xml:space="preserve">   (模擬retry送給PACS)</w:t>
       </w:r>
     </w:p>
     <w:p>
@@ -19927,31 +20101,7 @@
           <w:szCs w:val="18"/>
           <w:shd w:val="clear" w:color="auto" w:fill="FFFFFF"/>
         </w:rPr>
-        <w:t xml:space="preserve">    </w:t>
-      </w:r>
-      <w:r>
-        <w:rPr>
-          <w:rFonts w:ascii="標楷體" w:eastAsia="標楷體" w:hAnsi="標楷體" w:cs="Helvetica" w:hint="eastAsia"/>
-          <w:szCs w:val="18"/>
-          <w:shd w:val="clear" w:color="auto" w:fill="FFFFFF"/>
-        </w:rPr>
-        <w:t>(模擬retry送給</w:t>
-      </w:r>
-      <w:r>
-        <w:rPr>
-          <w:rFonts w:ascii="標楷體" w:eastAsia="標楷體" w:hAnsi="標楷體" w:cs="Helvetica" w:hint="eastAsia"/>
-          <w:szCs w:val="18"/>
-          <w:shd w:val="clear" w:color="auto" w:fill="FFFFFF"/>
-        </w:rPr>
-        <w:t>AI分析</w:t>
-      </w:r>
-      <w:r>
-        <w:rPr>
-          <w:rFonts w:ascii="標楷體" w:eastAsia="標楷體" w:hAnsi="標楷體" w:cs="Helvetica" w:hint="eastAsia"/>
-          <w:szCs w:val="18"/>
-          <w:shd w:val="clear" w:color="auto" w:fill="FFFFFF"/>
-        </w:rPr>
-        <w:t>)</w:t>
+        <w:t xml:space="preserve">    (模擬retry送給AI分析)</w:t>
       </w:r>
     </w:p>
     <w:p>

</xml_diff>